<commit_message>
Case study and cover: final-configuration evaluation wording
Replace "83% -> 100%" with 12 of 12 cases passed in the final
evaluation configuration, noting the earlier runs. Add an
independent-project line and Known limitations. Rebuild the PDF,
Word file and cover.
</commit_message>
<xml_diff>
--- a/CASE_STUDY.docx
+++ b/CASE_STUDY.docx
@@ -63,6 +63,14 @@
       </w:r>
     </w:p>
     <w:p>
+      <w:r>
+        <w:rPr>
+          <w:i/>
+        </w:rPr>
+        <w:t>An independent portfolio project, built outside my employment.</w:t>
+      </w:r>
+    </w:p>
+    <w:p>
       <w:pPr>
         <w:pStyle w:val="Heading2"/>
       </w:pPr>
@@ -83,7 +91,7 @@
     </w:p>
     <w:p>
       <w:r>
-        <w:t>What sets it apart is that it was proven at every layer: five of five rule scenarios matched their expected results; the staff-facing agent scored 83% → 92% → 100% on one 12-case test set, each step explained by a specific change; the whole chain ran end to end from a Teams chat; and the system moved from development to test as one managed package and was proven again there, with nothing rebuilt by hand.</w:t>
+        <w:t>What sets it apart is that it was tested at every layer: five of five rule scenarios matched their expected results; on one 12-case test set, 12 of 12 cases passed in the final evaluation configuration, after earlier runs of 83% and 92% in which the grader as well as the agent changed, each step explained by a specific change; the whole chain ran end to end from a Teams chat; and the system moved from development to test as one managed package and was proven again there, with nothing rebuilt by hand.</w:t>
       </w:r>
     </w:p>
     <w:p>
@@ -1299,6 +1307,84 @@
         <w:pStyle w:val="Heading2"/>
       </w:pPr>
       <w:r>
+        <w:t>Known limitations</w:t>
+      </w:r>
+    </w:p>
+    <w:p>
+      <w:pPr>
+        <w:pStyle w:val="ListBullet"/>
+      </w:pPr>
+      <w:r>
+        <w:rPr>
+          <w:b/>
+        </w:rPr>
+        <w:t>A portfolio system, not a production one.</w:t>
+      </w:r>
+      <w:r>
+        <w:t xml:space="preserve"> Built and tested in a one-person development environment and a sandbox test environment, with fictional data.</w:t>
+      </w:r>
+    </w:p>
+    <w:p>
+      <w:pPr>
+        <w:pStyle w:val="ListBullet"/>
+      </w:pPr>
+      <w:r>
+        <w:rPr>
+          <w:b/>
+        </w:rPr>
+        <w:t>The dashboard is not shared.</w:t>
+      </w:r>
+      <w:r>
+        <w:t xml:space="preserve"> The Power BI report runs in Power BI Desktop, not a shared workspace with access controls.</w:t>
+      </w:r>
+    </w:p>
+    <w:p>
+      <w:pPr>
+        <w:pStyle w:val="ListBullet"/>
+      </w:pPr>
+      <w:r>
+        <w:rPr>
+          <w:b/>
+        </w:rPr>
+        <w:t>Approval does not move stock.</w:t>
+      </w:r>
+      <w:r>
+        <w:t xml:space="preserve"> An approved transfer records the decision; there is no shipping or receipt step that updates inventory.</w:t>
+      </w:r>
+    </w:p>
+    <w:p>
+      <w:pPr>
+        <w:pStyle w:val="ListBullet"/>
+      </w:pPr>
+      <w:r>
+        <w:rPr>
+          <w:b/>
+        </w:rPr>
+        <w:t>Spoilage is checked only at request time.</w:t>
+      </w:r>
+      <w:r>
+        <w:t xml:space="preserve"> Stock already held past its shelf life is not flagged until someone requests a transfer.</w:t>
+      </w:r>
+    </w:p>
+    <w:p>
+      <w:pPr>
+        <w:pStyle w:val="ListBullet"/>
+      </w:pPr>
+      <w:r>
+        <w:rPr>
+          <w:b/>
+        </w:rPr>
+        <w:t>The evaluation is a fixed test set.</w:t>
+      </w:r>
+      <w:r>
+        <w:t xml:space="preserve"> 12 cases describe behaviour on those requests only and do not establish reliability across all possible requests.</w:t>
+      </w:r>
+    </w:p>
+    <w:p>
+      <w:pPr>
+        <w:pStyle w:val="Heading2"/>
+      </w:pPr>
+      <w:r>
         <w:t>What I would do next</w:t>
       </w:r>
     </w:p>

</xml_diff>